<commit_message>
fix(docx): embed visual-vocabulary images in lesson homework.docx (SVG→PNG); regenerate all 74
</commit_message>
<xml_diff>
--- a/lessons/1-1-flagship/homework.docx
+++ b/lessons/1-1-flagship/homework.docx
@@ -106,7 +106,55 @@
     </w:p>
     <w:p>
       <w:pPr>
-        <w:spacing w:after="60"/>
+        <w:keepNext/>
+        <w:spacing w:after="20" w:before="80"/>
+        <w:jc w:val="center"/>
+      </w:pPr>
+      <w:r>
+        <w:drawing>
+          <wp:inline distT="0" distB="0" distL="0" distR="0">
+            <wp:extent cx="1047750" cy="790575"/>
+            <wp:effectExtent t="0" r="0" b="0" l="0"/>
+            <wp:docPr id="1" name="" descr="" title=""/>
+            <wp:cNvGraphicFramePr>
+              <a:graphicFrameLocks xmlns:a="http://schemas.openxmlformats.org/drawingml/2006/main" noChangeAspect="1"/>
+            </wp:cNvGraphicFramePr>
+            <a:graphic xmlns:a="http://schemas.openxmlformats.org/drawingml/2006/main">
+              <a:graphicData uri="http://schemas.openxmlformats.org/drawingml/2006/picture">
+                <pic:pic xmlns:pic="http://schemas.openxmlformats.org/drawingml/2006/picture">
+                  <pic:nvPicPr>
+                    <pic:cNvPr id="0" name="" descr=""/>
+                    <pic:cNvPicPr>
+                      <a:picLocks noChangeAspect="1" noChangeArrowheads="1"/>
+                    </pic:cNvPicPr>
+                  </pic:nvPicPr>
+                  <pic:blipFill>
+                    <a:blip r:embed="rId7" cstate="none"/>
+                    <a:srcRect/>
+                    <a:stretch>
+                      <a:fillRect/>
+                    </a:stretch>
+                  </pic:blipFill>
+                  <pic:spPr bwMode="auto">
+                    <a:xfrm>
+                      <a:off x="0" y="0"/>
+                      <a:ext cx="1047750" cy="790575"/>
+                    </a:xfrm>
+                    <a:prstGeom prst="rect">
+                      <a:avLst/>
+                    </a:prstGeom>
+                  </pic:spPr>
+                </pic:pic>
+              </a:graphicData>
+            </a:graphic>
+          </wp:inline>
+        </w:drawing>
+      </w:r>
+    </w:p>
+    <w:p>
+      <w:pPr>
+        <w:keepNext/>
+        <w:spacing w:after="120"/>
       </w:pPr>
       <w:r>
         <w:rPr>
@@ -116,12 +164,60 @@
         <w:t xml:space="preserve">Prime number (Número primo)</w:t>
       </w:r>
       <w:r>
-        <w:t xml:space="preserve"> — A whole number greater than 1 that has exactly two factors: 1 and itself</w:t>
-      </w:r>
-    </w:p>
-    <w:p>
-      <w:pPr>
-        <w:spacing w:after="60"/>
+        <w:t xml:space="preserve"> — A number bigger than 1 that you can only divide by 1 and itself.</w:t>
+      </w:r>
+    </w:p>
+    <w:p>
+      <w:pPr>
+        <w:keepNext/>
+        <w:spacing w:after="20" w:before="80"/>
+        <w:jc w:val="center"/>
+      </w:pPr>
+      <w:r>
+        <w:drawing>
+          <wp:inline distT="0" distB="0" distL="0" distR="0">
+            <wp:extent cx="1047750" cy="790575"/>
+            <wp:effectExtent t="0" r="0" b="0" l="0"/>
+            <wp:docPr id="1" name="" descr="" title=""/>
+            <wp:cNvGraphicFramePr>
+              <a:graphicFrameLocks xmlns:a="http://schemas.openxmlformats.org/drawingml/2006/main" noChangeAspect="1"/>
+            </wp:cNvGraphicFramePr>
+            <a:graphic xmlns:a="http://schemas.openxmlformats.org/drawingml/2006/main">
+              <a:graphicData uri="http://schemas.openxmlformats.org/drawingml/2006/picture">
+                <pic:pic xmlns:pic="http://schemas.openxmlformats.org/drawingml/2006/picture">
+                  <pic:nvPicPr>
+                    <pic:cNvPr id="0" name="" descr=""/>
+                    <pic:cNvPicPr>
+                      <a:picLocks noChangeAspect="1" noChangeArrowheads="1"/>
+                    </pic:cNvPicPr>
+                  </pic:nvPicPr>
+                  <pic:blipFill>
+                    <a:blip r:embed="rId8" cstate="none"/>
+                    <a:srcRect/>
+                    <a:stretch>
+                      <a:fillRect/>
+                    </a:stretch>
+                  </pic:blipFill>
+                  <pic:spPr bwMode="auto">
+                    <a:xfrm>
+                      <a:off x="0" y="0"/>
+                      <a:ext cx="1047750" cy="790575"/>
+                    </a:xfrm>
+                    <a:prstGeom prst="rect">
+                      <a:avLst/>
+                    </a:prstGeom>
+                  </pic:spPr>
+                </pic:pic>
+              </a:graphicData>
+            </a:graphic>
+          </wp:inline>
+        </w:drawing>
+      </w:r>
+    </w:p>
+    <w:p>
+      <w:pPr>
+        <w:keepNext/>
+        <w:spacing w:after="120"/>
       </w:pPr>
       <w:r>
         <w:rPr>
@@ -131,12 +227,60 @@
         <w:t xml:space="preserve">Composite number (Número compuesto)</w:t>
       </w:r>
       <w:r>
-        <w:t xml:space="preserve"> — A whole number greater than 1 that has more than two factors</w:t>
-      </w:r>
-    </w:p>
-    <w:p>
-      <w:pPr>
-        <w:spacing w:after="60"/>
+        <w:t xml:space="preserve"> — A number bigger than 1 that you can divide by more than just 1 and itself.</w:t>
+      </w:r>
+    </w:p>
+    <w:p>
+      <w:pPr>
+        <w:keepNext/>
+        <w:spacing w:after="20" w:before="80"/>
+        <w:jc w:val="center"/>
+      </w:pPr>
+      <w:r>
+        <w:drawing>
+          <wp:inline distT="0" distB="0" distL="0" distR="0">
+            <wp:extent cx="1047750" cy="790575"/>
+            <wp:effectExtent t="0" r="0" b="0" l="0"/>
+            <wp:docPr id="1" name="" descr="" title=""/>
+            <wp:cNvGraphicFramePr>
+              <a:graphicFrameLocks xmlns:a="http://schemas.openxmlformats.org/drawingml/2006/main" noChangeAspect="1"/>
+            </wp:cNvGraphicFramePr>
+            <a:graphic xmlns:a="http://schemas.openxmlformats.org/drawingml/2006/main">
+              <a:graphicData uri="http://schemas.openxmlformats.org/drawingml/2006/picture">
+                <pic:pic xmlns:pic="http://schemas.openxmlformats.org/drawingml/2006/picture">
+                  <pic:nvPicPr>
+                    <pic:cNvPr id="0" name="" descr=""/>
+                    <pic:cNvPicPr>
+                      <a:picLocks noChangeAspect="1" noChangeArrowheads="1"/>
+                    </pic:cNvPicPr>
+                  </pic:nvPicPr>
+                  <pic:blipFill>
+                    <a:blip r:embed="rId9" cstate="none"/>
+                    <a:srcRect/>
+                    <a:stretch>
+                      <a:fillRect/>
+                    </a:stretch>
+                  </pic:blipFill>
+                  <pic:spPr bwMode="auto">
+                    <a:xfrm>
+                      <a:off x="0" y="0"/>
+                      <a:ext cx="1047750" cy="790575"/>
+                    </a:xfrm>
+                    <a:prstGeom prst="rect">
+                      <a:avLst/>
+                    </a:prstGeom>
+                  </pic:spPr>
+                </pic:pic>
+              </a:graphicData>
+            </a:graphic>
+          </wp:inline>
+        </w:drawing>
+      </w:r>
+    </w:p>
+    <w:p>
+      <w:pPr>
+        <w:keepNext/>
+        <w:spacing w:after="120"/>
       </w:pPr>
       <w:r>
         <w:rPr>
@@ -146,12 +290,60 @@
         <w:t xml:space="preserve">Prime factorization (Factorización prima)</w:t>
       </w:r>
       <w:r>
-        <w:t xml:space="preserve"> — Writing a number as a product of its prime factors</w:t>
-      </w:r>
-    </w:p>
-    <w:p>
-      <w:pPr>
-        <w:spacing w:after="60"/>
+        <w:t xml:space="preserve"> — Writing a number as prime numbers multiplied together.</w:t>
+      </w:r>
+    </w:p>
+    <w:p>
+      <w:pPr>
+        <w:keepNext/>
+        <w:spacing w:after="20" w:before="80"/>
+        <w:jc w:val="center"/>
+      </w:pPr>
+      <w:r>
+        <w:drawing>
+          <wp:inline distT="0" distB="0" distL="0" distR="0">
+            <wp:extent cx="1047750" cy="790575"/>
+            <wp:effectExtent t="0" r="0" b="0" l="0"/>
+            <wp:docPr id="1" name="" descr="" title=""/>
+            <wp:cNvGraphicFramePr>
+              <a:graphicFrameLocks xmlns:a="http://schemas.openxmlformats.org/drawingml/2006/main" noChangeAspect="1"/>
+            </wp:cNvGraphicFramePr>
+            <a:graphic xmlns:a="http://schemas.openxmlformats.org/drawingml/2006/main">
+              <a:graphicData uri="http://schemas.openxmlformats.org/drawingml/2006/picture">
+                <pic:pic xmlns:pic="http://schemas.openxmlformats.org/drawingml/2006/picture">
+                  <pic:nvPicPr>
+                    <pic:cNvPr id="0" name="" descr=""/>
+                    <pic:cNvPicPr>
+                      <a:picLocks noChangeAspect="1" noChangeArrowheads="1"/>
+                    </pic:cNvPicPr>
+                  </pic:nvPicPr>
+                  <pic:blipFill>
+                    <a:blip r:embed="rId9" cstate="none"/>
+                    <a:srcRect/>
+                    <a:stretch>
+                      <a:fillRect/>
+                    </a:stretch>
+                  </pic:blipFill>
+                  <pic:spPr bwMode="auto">
+                    <a:xfrm>
+                      <a:off x="0" y="0"/>
+                      <a:ext cx="1047750" cy="790575"/>
+                    </a:xfrm>
+                    <a:prstGeom prst="rect">
+                      <a:avLst/>
+                    </a:prstGeom>
+                  </pic:spPr>
+                </pic:pic>
+              </a:graphicData>
+            </a:graphic>
+          </wp:inline>
+        </w:drawing>
+      </w:r>
+    </w:p>
+    <w:p>
+      <w:pPr>
+        <w:keepNext/>
+        <w:spacing w:after="120"/>
       </w:pPr>
       <w:r>
         <w:rPr>
@@ -161,12 +353,60 @@
         <w:t xml:space="preserve">Factor tree (Árbol de factores)</w:t>
       </w:r>
       <w:r>
-        <w:t xml:space="preserve"> — A diagram that breaks a number into its prime factors step by step</w:t>
-      </w:r>
-    </w:p>
-    <w:p>
-      <w:pPr>
-        <w:spacing w:after="60"/>
+        <w:t xml:space="preserve"> — A picture that splits a number into its prime numbers, step by step.</w:t>
+      </w:r>
+    </w:p>
+    <w:p>
+      <w:pPr>
+        <w:keepNext/>
+        <w:spacing w:after="20" w:before="80"/>
+        <w:jc w:val="center"/>
+      </w:pPr>
+      <w:r>
+        <w:drawing>
+          <wp:inline distT="0" distB="0" distL="0" distR="0">
+            <wp:extent cx="1047750" cy="790575"/>
+            <wp:effectExtent t="0" r="0" b="0" l="0"/>
+            <wp:docPr id="1" name="" descr="" title=""/>
+            <wp:cNvGraphicFramePr>
+              <a:graphicFrameLocks xmlns:a="http://schemas.openxmlformats.org/drawingml/2006/main" noChangeAspect="1"/>
+            </wp:cNvGraphicFramePr>
+            <a:graphic xmlns:a="http://schemas.openxmlformats.org/drawingml/2006/main">
+              <a:graphicData uri="http://schemas.openxmlformats.org/drawingml/2006/picture">
+                <pic:pic xmlns:pic="http://schemas.openxmlformats.org/drawingml/2006/picture">
+                  <pic:nvPicPr>
+                    <pic:cNvPr id="0" name="" descr=""/>
+                    <pic:cNvPicPr>
+                      <a:picLocks noChangeAspect="1" noChangeArrowheads="1"/>
+                    </pic:cNvPicPr>
+                  </pic:nvPicPr>
+                  <pic:blipFill>
+                    <a:blip r:embed="rId10" cstate="none"/>
+                    <a:srcRect/>
+                    <a:stretch>
+                      <a:fillRect/>
+                    </a:stretch>
+                  </pic:blipFill>
+                  <pic:spPr bwMode="auto">
+                    <a:xfrm>
+                      <a:off x="0" y="0"/>
+                      <a:ext cx="1047750" cy="790575"/>
+                    </a:xfrm>
+                    <a:prstGeom prst="rect">
+                      <a:avLst/>
+                    </a:prstGeom>
+                  </pic:spPr>
+                </pic:pic>
+              </a:graphicData>
+            </a:graphic>
+          </wp:inline>
+        </w:drawing>
+      </w:r>
+    </w:p>
+    <w:p>
+      <w:pPr>
+        <w:keepNext/>
+        <w:spacing w:after="120"/>
       </w:pPr>
       <w:r>
         <w:rPr>
@@ -176,7 +416,7 @@
         <w:t xml:space="preserve">Exponent (Exponente)</w:t>
       </w:r>
       <w:r>
-        <w:t xml:space="preserve"> — A small number that shows how many times a base is multiplied by itself</w:t>
+        <w:t xml:space="preserve"> — A small number that tells how many times to multiply a number by itself.</w:t>
       </w:r>
     </w:p>
     <w:p>

</xml_diff>

<commit_message>
style: format codebase with biome and update homework
</commit_message>
<xml_diff>
--- a/lessons/1-1-flagship/homework.docx
+++ b/lessons/1-1-flagship/homework.docx
@@ -24,7 +24,7 @@
           <w:i/>
           <w:iCs/>
         </w:rPr>
-        <w:t xml:space="preserve">Lesson 1-1-flagship  •  Standard 6.NS.4</w:t>
+        <w:t xml:space="preserve">Lesson 1-1-flagship  •  Standard 6.NOS.4</w:t>
       </w:r>
     </w:p>
     <w:p>
@@ -1178,6 +1178,252 @@
       </w:r>
     </w:p>
     <w:p>
+      <w:pPr>
+        <w:spacing w:after="80" w:before="0"/>
+      </w:pPr>
+      <w:r>
+        <w:rPr>
+          <w:b/>
+          <w:bCs/>
+        </w:rPr>
+        <w:t xml:space="preserve">7. onLevel — Spot the Common Mistake</w:t>
+      </w:r>
+    </w:p>
+    <w:p>
+      <w:pPr>
+        <w:spacing w:after="40" w:before="0"/>
+      </w:pPr>
+      <w:r>
+        <w:t xml:space="preserve">   Step 1 (Read): A student is working on Prime Factorization.</w:t>
+      </w:r>
+    </w:p>
+    <w:p>
+      <w:pPr>
+        <w:spacing w:after="40" w:before="0"/>
+      </w:pPr>
+      <w:r>
+        <w:t xml:space="preserve">   Step 2 (Attempt): They ignored the rule: Keep breaking a number apart until every factor is a prime number you cannot split anymore.</w:t>
+      </w:r>
+    </w:p>
+    <w:p>
+      <w:pPr>
+        <w:spacing w:after="40" w:before="0"/>
+      </w:pPr>
+      <w:r>
+        <w:t xml:space="preserve">   Step 3 (Check): The answer does not match the math rule from class.</w:t>
+      </w:r>
+    </w:p>
+    <w:p>
+      <w:pPr>
+        <w:spacing w:after="60" w:before="0"/>
+      </w:pPr>
+      <w:r>
+        <w:rPr>
+          <w:i/>
+          <w:iCs/>
+        </w:rPr>
+        <w:t xml:space="preserve">Which step has the mistake? Explain and fix it:</w:t>
+      </w:r>
+    </w:p>
+    <w:p>
+      <w:pPr>
+        <w:spacing w:after="60" w:before="120"/>
+      </w:pPr>
+      <w:r>
+        <w:rPr>
+          <w:color w:val="BBBBBB"/>
+        </w:rPr>
+        <w:t xml:space="preserve">______________________________________________________________________</w:t>
+      </w:r>
+    </w:p>
+    <w:p>
+      <w:pPr>
+        <w:spacing w:after="60" w:before="120"/>
+      </w:pPr>
+      <w:r>
+        <w:rPr>
+          <w:color w:val="BBBBBB"/>
+        </w:rPr>
+        <w:t xml:space="preserve">______________________________________________________________________</w:t>
+      </w:r>
+    </w:p>
+    <w:p>
+      <w:pPr>
+        <w:spacing w:after="60" w:before="120"/>
+      </w:pPr>
+      <w:r>
+        <w:rPr>
+          <w:color w:val="BBBBBB"/>
+        </w:rPr>
+        <w:t xml:space="preserve">______________________________________________________________________</w:t>
+      </w:r>
+    </w:p>
+    <w:p>
+      <w:pPr>
+        <w:spacing w:after="80" w:before="0"/>
+      </w:pPr>
+      <w:r>
+        <w:rPr>
+          <w:b/>
+          <w:bCs/>
+        </w:rPr>
+        <w:t xml:space="preserve">8. Lock 1 — Access clue: A whole number greater than 1 with exactly two factors (1 and itself) is called what?</w:t>
+      </w:r>
+    </w:p>
+    <w:p>
+      <w:pPr>
+        <w:spacing w:after="40" w:before="0"/>
+      </w:pPr>
+      <w:r>
+        <w:t xml:space="preserve">     A. A prime number</w:t>
+      </w:r>
+    </w:p>
+    <w:p>
+      <w:pPr>
+        <w:spacing w:after="40" w:before="0"/>
+      </w:pPr>
+      <w:r>
+        <w:t xml:space="preserve">     B. A composite number</w:t>
+      </w:r>
+    </w:p>
+    <w:p>
+      <w:pPr>
+        <w:spacing w:after="40" w:before="0"/>
+      </w:pPr>
+      <w:r>
+        <w:t xml:space="preserve">     C. A factor tree</w:t>
+      </w:r>
+    </w:p>
+    <w:p>
+      <w:pPr>
+        <w:spacing w:after="40" w:before="0"/>
+      </w:pPr>
+      <w:r>
+        <w:t xml:space="preserve">     D. An exponent</w:t>
+      </w:r>
+    </w:p>
+    <w:p>
+      <w:pPr>
+        <w:spacing w:after="60" w:before="120"/>
+      </w:pPr>
+      <w:r>
+        <w:rPr>
+          <w:color w:val="BBBBBB"/>
+        </w:rPr>
+        <w:t xml:space="preserve">______________________________________________________________________</w:t>
+      </w:r>
+    </w:p>
+    <w:p>
+      <w:pPr>
+        <w:spacing w:after="80" w:before="0"/>
+      </w:pPr>
+      <w:r>
+        <w:rPr>
+          <w:b/>
+          <w:bCs/>
+        </w:rPr>
+        <w:t xml:space="preserve">9. Lock 2 — Build the factor tree for 72. What is its prime factorization?</w:t>
+      </w:r>
+    </w:p>
+    <w:p>
+      <w:pPr>
+        <w:spacing w:after="40" w:before="0"/>
+      </w:pPr>
+      <w:r>
+        <w:t xml:space="preserve">     A. 2 × 2 × 2 × 3 × 3</w:t>
+      </w:r>
+    </w:p>
+    <w:p>
+      <w:pPr>
+        <w:spacing w:after="40" w:before="0"/>
+      </w:pPr>
+      <w:r>
+        <w:t xml:space="preserve">     B. 2 × 4 × 9</w:t>
+      </w:r>
+    </w:p>
+    <w:p>
+      <w:pPr>
+        <w:spacing w:after="40" w:before="0"/>
+      </w:pPr>
+      <w:r>
+        <w:t xml:space="preserve">     C. 8 × 9</w:t>
+      </w:r>
+    </w:p>
+    <w:p>
+      <w:pPr>
+        <w:spacing w:after="40" w:before="0"/>
+      </w:pPr>
+      <w:r>
+        <w:t xml:space="preserve">     D. 2 × 3 × 12</w:t>
+      </w:r>
+    </w:p>
+    <w:p>
+      <w:pPr>
+        <w:spacing w:after="60" w:before="120"/>
+      </w:pPr>
+      <w:r>
+        <w:rPr>
+          <w:color w:val="BBBBBB"/>
+        </w:rPr>
+        <w:t xml:space="preserve">______________________________________________________________________</w:t>
+      </w:r>
+    </w:p>
+    <w:p>
+      <w:pPr>
+        <w:spacing w:after="80" w:before="0"/>
+      </w:pPr>
+      <w:r>
+        <w:rPr>
+          <w:b/>
+          <w:bCs/>
+        </w:rPr>
+        <w:t xml:space="preserve">10. Lock 3 — Rewrite the prime factorization of 72 in exponent form.</w:t>
+      </w:r>
+    </w:p>
+    <w:p>
+      <w:pPr>
+        <w:spacing w:after="40" w:before="0"/>
+      </w:pPr>
+      <w:r>
+        <w:t xml:space="preserve">     A. 2³ × 3²</w:t>
+      </w:r>
+    </w:p>
+    <w:p>
+      <w:pPr>
+        <w:spacing w:after="40" w:before="0"/>
+      </w:pPr>
+      <w:r>
+        <w:t xml:space="preserve">     B. 2² × 3³</w:t>
+      </w:r>
+    </w:p>
+    <w:p>
+      <w:pPr>
+        <w:spacing w:after="40" w:before="0"/>
+      </w:pPr>
+      <w:r>
+        <w:t xml:space="preserve">     C. 2 × 3⁵</w:t>
+      </w:r>
+    </w:p>
+    <w:p>
+      <w:pPr>
+        <w:spacing w:after="40" w:before="0"/>
+      </w:pPr>
+      <w:r>
+        <w:t xml:space="preserve">     D. 6²</w:t>
+      </w:r>
+    </w:p>
+    <w:p>
+      <w:pPr>
+        <w:spacing w:after="60" w:before="120"/>
+      </w:pPr>
+      <w:r>
+        <w:rPr>
+          <w:color w:val="BBBBBB"/>
+        </w:rPr>
+        <w:t xml:space="preserve">______________________________________________________________________</w:t>
+      </w:r>
+    </w:p>
+    <w:p>
       <w:r>
         <w:br w:type="page"/>
       </w:r>
@@ -1209,10 +1455,22 @@
     </w:p>
     <w:p>
       <w:pPr>
+        <w:spacing w:after="20" w:before="0"/>
+      </w:pPr>
+      <w:r>
+        <w:t xml:space="preserve">     17 has exactly two factors: 1 and 17. 15 = 3 × 5, 21 = 3 × 7, and 9 = 3 × 3, so they are all composite.</w:t>
+      </w:r>
+    </w:p>
+    <w:p>
+      <w:pPr>
         <w:spacing w:after="80" w:before="0"/>
       </w:pPr>
       <w:r>
-        <w:t xml:space="preserve">     17 has exactly two factors: 1 and 17. 15 = 3 × 5, 21 = 3 × 7, and 9 = 3 × 3, so they are all composite.</w:t>
+        <w:rPr>
+          <w:i/>
+          <w:iCs/>
+        </w:rPr>
+        <w:t xml:space="preserve">     Watch for: A common mistake in Prime Factorization is skipping the key idea: "Keep breaking a number apart until every factor is a prime number you cannot split anymore." — always check your work against this rule before you submit.</w:t>
       </w:r>
     </w:p>
     <w:p>
@@ -1229,10 +1487,22 @@
     </w:p>
     <w:p>
       <w:pPr>
+        <w:spacing w:after="20" w:before="0"/>
+      </w:pPr>
+      <w:r>
+        <w:t xml:space="preserve">     30 = 2 × 15 = 2 × 3 × 5. All three factors (2, 3, 5) are prime, so 2 × 3 × 5 is the prime factorization.</w:t>
+      </w:r>
+    </w:p>
+    <w:p>
+      <w:pPr>
         <w:spacing w:after="80" w:before="0"/>
       </w:pPr>
       <w:r>
-        <w:t xml:space="preserve">     30 = 2 × 15 = 2 × 3 × 5. All three factors (2, 3, 5) are prime, so 2 × 3 × 5 is the prime factorization.</w:t>
+        <w:rPr>
+          <w:i/>
+          <w:iCs/>
+        </w:rPr>
+        <w:t xml:space="preserve">     Watch for: A common mistake in Prime Factorization is skipping the key idea: "Keep breaking a number apart until every factor is a prime number you cannot split anymore." — always check your work against this rule before you submit.</w:t>
       </w:r>
     </w:p>
     <w:p>
@@ -1453,10 +1723,146 @@
     </w:p>
     <w:p>
       <w:pPr>
+        <w:spacing w:after="20" w:before="0"/>
+      </w:pPr>
+      <w:r>
+        <w:t xml:space="preserve">     The Fundamental Theorem of Arithmetic says every composite number has exactly one prime factorization. No matter how you start the factor tree, you always end with 2 × 2 × 3 × 5.</w:t>
+      </w:r>
+    </w:p>
+    <w:p>
+      <w:pPr>
         <w:spacing w:after="80" w:before="0"/>
       </w:pPr>
       <w:r>
-        <w:t xml:space="preserve">     The Fundamental Theorem of Arithmetic says every composite number has exactly one prime factorization. No matter how you start the factor tree, you always end with 2 × 2 × 3 × 5.</w:t>
+        <w:rPr>
+          <w:i/>
+          <w:iCs/>
+        </w:rPr>
+        <w:t xml:space="preserve">     Watch for: A common mistake in Prime Factorization is skipping the key idea: "Keep breaking a number apart until every factor is a prime number you cannot split anymore." — always check your work against this rule before you submit.</w:t>
+      </w:r>
+    </w:p>
+    <w:p>
+      <w:pPr>
+        <w:spacing w:after="40" w:before="0"/>
+      </w:pPr>
+      <w:r>
+        <w:rPr>
+          <w:b/>
+          <w:bCs/>
+        </w:rPr>
+        <w:t xml:space="preserve">7. onLevel — Spot the Common Mistake</w:t>
+      </w:r>
+    </w:p>
+    <w:p>
+      <w:pPr>
+        <w:spacing w:after="20" w:before="0"/>
+      </w:pPr>
+      <w:r>
+        <w:t xml:space="preserve">     The mistake is in Step 2.</w:t>
+      </w:r>
+    </w:p>
+    <w:p>
+      <w:pPr>
+        <w:spacing w:after="20" w:before="0"/>
+      </w:pPr>
+      <w:r>
+        <w:t xml:space="preserve">     Correct work: Follow the key idea: Keep breaking a number apart until every factor is a prime number you cannot split anymore.</w:t>
+      </w:r>
+    </w:p>
+    <w:p>
+      <w:pPr>
+        <w:spacing w:after="40" w:before="0"/>
+      </w:pPr>
+      <w:r>
+        <w:rPr>
+          <w:b/>
+          <w:bCs/>
+        </w:rPr>
+        <w:t xml:space="preserve">8. A. A prime number</w:t>
+      </w:r>
+    </w:p>
+    <w:p>
+      <w:pPr>
+        <w:spacing w:after="20" w:before="0"/>
+      </w:pPr>
+      <w:r>
+        <w:t xml:space="preserve">     A prime number has exactly two factors: 1 and itself. A composite number has more than two factors.</w:t>
+      </w:r>
+    </w:p>
+    <w:p>
+      <w:pPr>
+        <w:spacing w:after="80" w:before="0"/>
+      </w:pPr>
+      <w:r>
+        <w:rPr>
+          <w:i/>
+          <w:iCs/>
+        </w:rPr>
+        <w:t xml:space="preserve">     Watch for: A common mistake in Prime Factorization is skipping the key idea: "Keep breaking a number apart until every factor is a prime number you cannot split anymore." — always check your work against this rule before you submit.</w:t>
+      </w:r>
+    </w:p>
+    <w:p>
+      <w:pPr>
+        <w:spacing w:after="40" w:before="0"/>
+      </w:pPr>
+      <w:r>
+        <w:rPr>
+          <w:b/>
+          <w:bCs/>
+        </w:rPr>
+        <w:t xml:space="preserve">9. A. 2 × 2 × 2 × 3 × 3</w:t>
+      </w:r>
+    </w:p>
+    <w:p>
+      <w:pPr>
+        <w:spacing w:after="20" w:before="0"/>
+      </w:pPr>
+      <w:r>
+        <w:t xml:space="preserve">     72 = 8 × 9 = (2 × 2 × 2) × (3 × 3) = 2 × 2 × 2 × 3 × 3. Every factor is prime.</w:t>
+      </w:r>
+    </w:p>
+    <w:p>
+      <w:pPr>
+        <w:spacing w:after="80" w:before="0"/>
+      </w:pPr>
+      <w:r>
+        <w:rPr>
+          <w:i/>
+          <w:iCs/>
+        </w:rPr>
+        <w:t xml:space="preserve">     Watch for: A common mistake in Prime Factorization is skipping the key idea: "Keep breaking a number apart until every factor is a prime number you cannot split anymore." — always check your work against this rule before you submit.</w:t>
+      </w:r>
+    </w:p>
+    <w:p>
+      <w:pPr>
+        <w:spacing w:after="40" w:before="0"/>
+      </w:pPr>
+      <w:r>
+        <w:rPr>
+          <w:b/>
+          <w:bCs/>
+        </w:rPr>
+        <w:t xml:space="preserve">10. A. 2³ × 3²</w:t>
+      </w:r>
+    </w:p>
+    <w:p>
+      <w:pPr>
+        <w:spacing w:after="20" w:before="0"/>
+      </w:pPr>
+      <w:r>
+        <w:t xml:space="preserve">     72 = 2 × 2 × 2 × 3 × 3. Three 2s and two 3s give 2³ × 3².</w:t>
+      </w:r>
+    </w:p>
+    <w:p>
+      <w:pPr>
+        <w:spacing w:after="80" w:before="0"/>
+      </w:pPr>
+      <w:r>
+        <w:rPr>
+          <w:i/>
+          <w:iCs/>
+        </w:rPr>
+        <w:t xml:space="preserve">     Watch for: A common mistake in Prime Factorization is skipping the key idea: "Keep breaking a number apart until every factor is a prime number you cannot split anymore." — always check your work against this rule before you submit.</w:t>
       </w:r>
     </w:p>
     <w:sectPr>

</xml_diff>